<commit_message>
fix: solving and implementing corrections based on what was discussed with Dr.Jacobs
</commit_message>
<xml_diff>
--- a/Parcial_SC_JuanCamiloGallardo.docx
+++ b/Parcial_SC_JuanCamiloGallardo.docx
@@ -159,6 +159,92 @@
         <w:t xml:space="preserve">Punto 1: Complejidad de Internet mediante un Modelo Matemático</w:t>
       </w:r>
       <w:bookmarkEnd w:id="1"/>
+    </w:p>
+    <w:p>
+      <w:r>
+        <w:rPr>
+          <w:b/>
+        </w:rPr>
+        <w:t>¿Qué es complejidad?</w:t>
+      </w:r>
+    </w:p>
+    <w:p>
+      <w:r>
+        <w:t>Antes de modelar Internet matemáticamente es necesario precisar qué entendemos por un sistema complejo. Un sistema es complejo cuando exhibe simultáneamente las siguientes propiedades:</w:t>
+      </w:r>
+    </w:p>
+    <w:p>
+      <w:r>
+        <w:t>1. Gran número de componentes que interactúan localmente, sin un control central que dicte el comportamiento global.</w:t>
+      </w:r>
+    </w:p>
+    <w:p>
+      <w:r>
+        <w:t>2. Interacciones no lineales y con retroalimentación, de modo que pequeños cambios locales pueden producir efectos globales desproporcionados.</w:t>
+      </w:r>
+    </w:p>
+    <w:p>
+      <w:r>
+        <w:t>3. Emergencia: aparecen propiedades macroscópicas (distribuciones, patrones, estructuras) que no están presentes en ningún componente por separado.</w:t>
+      </w:r>
+    </w:p>
+    <w:p>
+      <w:r>
+        <w:t>4. Auto-organización y robustez estructural frente a perturbaciones aleatorias, junto con fragilidad frente a perturbaciones dirigidas.</w:t>
+      </w:r>
+    </w:p>
+    <w:p>
+      <w:r>
+        <w:t>5. Dependencia sensible de la historia y de los detalles de las interacciones, lo que impide una descripción puramente reduccionista.</w:t>
+      </w:r>
+    </w:p>
+    <w:p>
+      <w:r>
+        <w:t>La complejidad, entonces, no es un atributo numérico sino un régimen de comportamiento: un sistema es complejo cuando su descripción global sólo puede obtenerse a través de sus interacciones.</w:t>
+      </w:r>
+    </w:p>
+    <w:p>
+      <w:r>
+        <w:rPr>
+          <w:b/>
+        </w:rPr>
+        <w:t>Cómo el modelo de Internet realiza cada propiedad</w:t>
+      </w:r>
+    </w:p>
+    <w:p>
+      <w:r>
+        <w:t>El modelo matemático que se desarrolla a continuación (grafo con distribución de grado libre de escala y crecimiento con conexión preferencial al estilo Barabási–Albert) describe la complejidad de Internet anclando cada propiedad anterior a un elemento formal:</w:t>
+      </w:r>
+    </w:p>
+    <w:p>
+      <w:r>
+        <w:t>• Gran número de componentes que interactúan localmente ↔ los nodos del grafo G=(V,E) y sus aristas; ningún nodo conoce la topología global, sólo su vecindario.</w:t>
+      </w:r>
+    </w:p>
+    <w:p>
+      <w:r>
+        <w:t>• No linealidad y retroalimentación ↔ la regla de conexión preferencial P(i) ∝ k_i, que amplifica a los nodos ya conectados (efecto rich-gets-richer).</w:t>
+      </w:r>
+    </w:p>
+    <w:p>
+      <w:r>
+        <w:t>• Emergencia ↔ la distribución de grado P(k) ∝ k^(-γ) no es impuesta por ningún nodo; surge como propiedad global del ensamble.</w:t>
+      </w:r>
+    </w:p>
+    <w:p>
+      <w:r>
+        <w:t>• Auto-organización robusta y fragilidad dirigida ↔ la red sobrevive a la caída del 80% de nodos aleatorios, pero colapsa al retirar los 5–10 hubs principales. Dualidad característica de los sistemas complejos.</w:t>
+      </w:r>
+    </w:p>
+    <w:p>
+      <w:r>
+        <w:t>• Dependencia de la historia ↔ la topología actual es producto del orden de llegada de nodos y del valor k_i en cada paso t; no existe una fórmula cerrada independiente del proceso de crecimiento.</w:t>
+      </w:r>
+    </w:p>
+    <w:p>
+      <w:r>
+        <w:t>Por tanto, afirmar que Internet es complejo significa, desde este modelo, que su estructura y su comportamiento sólo son comprensibles como propiedades emergentes de una dinámica local de crecimiento con acoplamiento preferencial.</w:t>
+      </w:r>
     </w:p>
     <w:p>
       <w:pPr>
@@ -5375,96 +5461,7 @@
         <w:spacing w:line="360" w:after="210" w:lineRule="auto"/>
       </w:pPr>
       <w:r>
-        <w:rPr>
-          <w:rFonts w:eastAsia="georgia" w:cs="georgia" w:ascii="georgia" w:hAnsi="georgia"/>
-          <w:color w:val="000000"/>
-        </w:rPr>
-        <w:t xml:space="preserve">El archivo </w:t>
-      </w:r>
-      <w:r>
-        <w:rPr>
-          <w:rStyle w:val="VerbatimChar"/>
-          <w:rFonts w:eastAsia="menlo" w:cs="menlo" w:ascii="menlo" w:hAnsi="menlo"/>
-          <w:color w:val="000000"/>
-          <w:sz w:val="18"/>
-          <w:shd w:val="clear" w:color="auto" w:fill="F8F8FA"/>
-        </w:rPr>
-        <w:t xml:space="preserve">punto3_net_interactions.py</w:t>
-      </w:r>
-      <w:r>
-        <w:rPr>
-          <w:rFonts w:eastAsia="georgia" w:cs="georgia" w:ascii="georgia" w:hAnsi="georgia"/>
-          <w:color w:val="000000"/>
-        </w:rPr>
-        <w:t xml:space="preserve"> implementa las funciones </w:t>
-      </w:r>
-      <w:r>
-        <w:rPr>
-          <w:rStyle w:val="VerbatimChar"/>
-          <w:rFonts w:eastAsia="menlo" w:cs="menlo" w:ascii="menlo" w:hAnsi="menlo"/>
-          <w:color w:val="000000"/>
-          <w:sz w:val="18"/>
-          <w:shd w:val="clear" w:color="auto" w:fill="F8F8FA"/>
-        </w:rPr>
-        <w:t xml:space="preserve">interaccion_atraccion</w:t>
-      </w:r>
-      <w:r>
-        <w:rPr>
-          <w:rFonts w:eastAsia="georgia" w:cs="georgia" w:ascii="georgia" w:hAnsi="georgia"/>
-          <w:color w:val="000000"/>
-        </w:rPr>
-        <w:t xml:space="preserve">, </w:t>
-      </w:r>
-      <w:r>
-        <w:rPr>
-          <w:rStyle w:val="VerbatimChar"/>
-          <w:rFonts w:eastAsia="menlo" w:cs="menlo" w:ascii="menlo" w:hAnsi="menlo"/>
-          <w:color w:val="000000"/>
-          <w:sz w:val="18"/>
-          <w:shd w:val="clear" w:color="auto" w:fill="F8F8FA"/>
-        </w:rPr>
-        <w:t xml:space="preserve">interaccion_repulsion</w:t>
-      </w:r>
-      <w:r>
-        <w:rPr>
-          <w:rFonts w:eastAsia="georgia" w:cs="georgia" w:ascii="georgia" w:hAnsi="georgia"/>
-          <w:color w:val="000000"/>
-        </w:rPr>
-        <w:t xml:space="preserve">, </w:t>
-      </w:r>
-      <w:r>
-        <w:rPr>
-          <w:rStyle w:val="VerbatimChar"/>
-          <w:rFonts w:eastAsia="menlo" w:cs="menlo" w:ascii="menlo" w:hAnsi="menlo"/>
-          <w:color w:val="000000"/>
-          <w:sz w:val="18"/>
-          <w:shd w:val="clear" w:color="auto" w:fill="F8F8FA"/>
-        </w:rPr>
-        <w:t xml:space="preserve">net_interaction</w:t>
-      </w:r>
-      <w:r>
-        <w:rPr>
-          <w:rFonts w:eastAsia="georgia" w:cs="georgia" w:ascii="georgia" w:hAnsi="georgia"/>
-          <w:color w:val="000000"/>
-        </w:rPr>
-        <w:t xml:space="preserve"> y </w:t>
-      </w:r>
-      <w:r>
-        <w:rPr>
-          <w:rStyle w:val="VerbatimChar"/>
-          <w:rFonts w:eastAsia="menlo" w:cs="menlo" w:ascii="menlo" w:hAnsi="menlo"/>
-          <w:color w:val="000000"/>
-          <w:sz w:val="18"/>
-          <w:shd w:val="clear" w:color="auto" w:fill="F8F8FA"/>
-        </w:rPr>
-        <w:t xml:space="preserve">paso_dinamica</w:t>
-      </w:r>
-      <w:r>
-        <w:rPr>
-          <w:rFonts w:eastAsia="georgia" w:cs="georgia" w:ascii="georgia" w:hAnsi="georgia"/>
-          <w:color w:val="000000"/>
-        </w:rPr>
-        <w:t xml:space="preserve">, siguiendo estrictamente el modelo matemático anterior con paradigma funcional en Python.</w:t>
+        <w:t>El archivo punto3_net_interactions.py instancia el modelo de net interactions en una aplicación real de tipo cliente–servidor. Se definen N clientes y M servidores: cada servidor es un emisor que ejerce sobre cada cliente una señal de latencia I(s, c) = (carga_s / capacidad_s)². La interacción neta NI(c) es el vector de latencias percibidas por el cliente desde todos los servidores, y su regla local es migrar al servidor de menor señal. La dinámica se implementa con map y reduce (barrido Gauss–Seidel asíncrono), sin bucles mutables, fiel al paradigma funcional.</w:t>
       </w:r>
     </w:p>
     <w:p>
@@ -5523,28 +5520,7 @@
         <w:spacing w:line="360" w:after="210" w:lineRule="auto"/>
       </w:pPr>
       <w:r>
-        <w:rPr>
-          <w:rFonts w:eastAsia="georgia" w:cs="georgia" w:ascii="georgia" w:hAnsi="georgia"/>
-          <w:color w:val="000000"/>
-        </w:rPr>
-        <w:t xml:space="preserve">La simulación muestra cómo cinco entidades con estados iniciales </w:t>
-      </w:r>
-      <w:r>
-        <w:rPr>
-          <w:rStyle w:val="VerbatimChar"/>
-          <w:rFonts w:eastAsia="menlo" w:cs="menlo" w:ascii="menlo" w:hAnsi="menlo"/>
-          <w:color w:val="000000"/>
-          <w:sz w:val="18"/>
-          <w:shd w:val="clear" w:color="auto" w:fill="F8F8FA"/>
-        </w:rPr>
-        <w:t xml:space="preserve">[0.0, 2.0, 5.0, 8.0, 10.0]</w:t>
-      </w:r>
-      <w:r>
-        <w:rPr>
-          <w:rFonts w:eastAsia="georgia" w:cs="georgia" w:ascii="georgia" w:hAnsi="georgia"/>
-          <w:color w:val="000000"/>
-        </w:rPr>
-        <w:t xml:space="preserve"> convergen progresivamente hacia un valor común (media del grupo), ilustrando que ninguna entidad evoluciona de forma aislada: su estado futuro es siempre función del conjunto de interacciones recibidas del resto del sistema.</w:t>
+        <w:t>La simulación parte de un escenario patológico en el que todos los clientes apuntan al mismo servidor sobrecargado y muestra cómo, tras pocas iteraciones, la carga se redistribuye proporcionalmente a la capacidad de cada servidor. El equilibrio final emerge de interacciones locales (cada cliente sólo compara las latencias percibidas) sin intervención de un planificador central.</w:t>
       </w:r>
     </w:p>
     <w:p>
@@ -7416,30 +7392,6 @@
       <w:pPr>
         <w:spacing w:line="360" w:after="210" w:lineRule="auto"/>
       </w:pPr>
-      <w:r>
-        <w:rPr>
-          <w:rFonts w:eastAsia="georgia" w:cs="georgia" w:ascii="georgia" w:hAnsi="georgia"/>
-          <w:color w:val="000000"/>
-        </w:rPr>
-        <w:t xml:space="preserve">El archivo </w:t>
-      </w:r>
-      <w:r>
-        <w:rPr>
-          <w:rStyle w:val="VerbatimChar"/>
-          <w:rFonts w:eastAsia="menlo" w:cs="menlo" w:ascii="menlo" w:hAnsi="menlo"/>
-          <w:color w:val="000000"/>
-          <w:sz w:val="18"/>
-          <w:shd w:val="clear" w:color="auto" w:fill="F8F8FA"/>
-        </w:rPr>
-        <w:t xml:space="preserve">punto4_feigenbaum.py</w:t>
-      </w:r>
-      <w:r>
-        <w:rPr>
-          <w:rFonts w:eastAsia="georgia" w:cs="georgia" w:ascii="georgia" w:hAnsi="georgia"/>
-          <w:color w:val="000000"/>
-        </w:rPr>
-        <w:t xml:space="preserve"> detecta las primeras bifurcaciones del mapa logístico (modelo del sistema de control), calcula los </w:t>
-      </w:r>
       <m:oMath>
         <m:r>
           <m:rPr>
@@ -7452,11 +7404,7 @@
         </m:r>
       </m:oMath>
       <w:r>
-        <w:rPr>
-          <w:rFonts w:eastAsia="georgia" w:cs="georgia" w:ascii="georgia" w:hAnsi="georgia"/>
-          <w:color w:val="000000"/>
-        </w:rPr>
-        <w:t xml:space="preserve"> empíricos para verificar la universalidad, y predice el umbral de caos usando la fórmula anterior.</w:t>
+        <w:t>El archivo punto4_feigenbaum.py aplica la universalidad δ a un problema de ingeniería de software: un algoritmo iterativo cuyo ratio de mejora de la complejidad computacional entre pasos consecutivos se modela como x_{n+1} = λ·x_n·(1 - x_n). Se fija una tolerancia constante Δ que el algoritmo debe satisfacer en cada paso (|x_{n+1} - x_n| &lt; Δ) para declararse convergido. El script detecta las bifurcaciones sucesivas con un filtro anti-ruido (varias confirmaciones consecutivas), calcula los δ empíricos para verificar la universalidad, y predice el umbral de caos λ_∞ ≈ λ_n + (λ_n - λ_{n-1})/(δ-1). Finalmente clasifica el algoritmo bajo distintas ganancias (convergido / periódico / caótico) y recomienda una ganancia máxima segura.</w:t>
       </w:r>
     </w:p>
     <w:p>
@@ -7517,37 +7465,29 @@
         <w:spacing w:line="336" w:lineRule="auto"/>
       </w:pPr>
       <w:r>
-        <w:rPr>
-          <w:rStyle w:val="VerbatimChar"/>
-          <w:rFonts w:eastAsia="menlo" w:cs="menlo" w:ascii="menlo" w:hAnsi="menlo"/>
-          <w:color w:val="000000"/>
-          <w:sz w:val="18"/>
-        </w:rPr>
-        <w:t xml:space="preserve">Bifurcaciones encontradas (λ_n — ganancia crítica):</w:t>
+        <w:t>Detectando bifurcaciones (ganancias críticas del algoritmo)...</w:t>
         <w:br/>
-        <w:t xml:space="preserve">  λ_1 = 3.00000000  (periodo 2)</w:t>
+        <w:t xml:space="preserve">  λ_1 ≈ 3.00010  (período 2)</w:t>
         <w:br/>
-        <w:t xml:space="preserve">  λ_2 = 3.44900000  (periodo 4)</w:t>
+        <w:t xml:space="preserve">  λ_2 ≈ 3.44956  (período 4)</w:t>
         <w:br/>
-        <w:t xml:space="preserve">  λ_3 = 3.54400000  (periodo 8)</w:t>
+        <w:t xml:space="preserve">  λ_3 ≈ 3.54408  (período 8)</w:t>
         <w:br/>
-        <w:t xml:space="preserve">  λ_4 = 3.56440000  (periodo 16)</w:t>
+        <w:t xml:space="preserve">  λ_4 ≈ 3.56456  (período 16)</w:t>
         <w:br/>
-        <w:t xml:space="preserve">  λ_5 = 3.56875000  (periodo 32)</w:t>
         <w:br/>
-        <w:t xml:space="preserve"/>
+        <w:t>δ empíricos:         [4.76, 4.62]</w:t>
         <w:br/>
-        <w:t xml:space="preserve">δ empíricos:         [4.7..., 4.6...]</w:t>
+        <w:t>δ Feigenbaum teórico: 4.6692016091</w:t>
         <w:br/>
-        <w:t xml:space="preserve">δ Feigenbaum teórico: 4.6692016091</w:t>
         <w:br/>
-        <w:t xml:space="preserve"/>
+        <w:t>Umbral de caos predicho: λ_∞ ≈ 3.5701</w:t>
         <w:br/>
-        <w:t xml:space="preserve">→ Umbral de caos predicho: λ_∞ ≈ 3.569946</w:t>
+        <w:t>Valor aceptado:          λ_∞ ≈ 3.5699</w:t>
         <w:br/>
-        <w:t xml:space="preserve">  El sistema de control es seguro para λ &lt; 3.5699</w:t>
         <w:br/>
-        <w:t xml:space="preserve"/>
+        <w:t>Recomendación: operar con λ ≤ 3.5501 (umbral menos margen 0.02).</w:t>
+        <w:br/>
       </w:r>
     </w:p>
     <w:p>
@@ -8603,30 +8543,6 @@
       <w:pPr>
         <w:spacing w:line="360" w:after="210" w:lineRule="auto"/>
       </w:pPr>
-      <w:r>
-        <w:rPr>
-          <w:rFonts w:eastAsia="georgia" w:cs="georgia" w:ascii="georgia" w:hAnsi="georgia"/>
-          <w:color w:val="000000"/>
-        </w:rPr>
-        <w:t xml:space="preserve">El archivo </w:t>
-      </w:r>
-      <w:r>
-        <w:rPr>
-          <w:rStyle w:val="VerbatimChar"/>
-          <w:rFonts w:eastAsia="menlo" w:cs="menlo" w:ascii="menlo" w:hAnsi="menlo"/>
-          <w:color w:val="000000"/>
-          <w:sz w:val="18"/>
-          <w:shd w:val="clear" w:color="auto" w:fill="F8F8FA"/>
-        </w:rPr>
-        <w:t xml:space="preserve">punto5_abm_atractor.py</w:t>
-      </w:r>
-      <w:r>
-        <w:rPr>
-          <w:rFonts w:eastAsia="georgia" w:cs="georgia" w:ascii="georgia" w:hAnsi="georgia"/>
-          <w:color w:val="000000"/>
-        </w:rPr>
-        <w:t xml:space="preserve"> implementa una población de 20 agentes con opiniones en </w:t>
-      </w:r>
       <m:oMath>
         <m:r>
           <m:rPr>
@@ -8674,28 +8590,6 @@
           <m:t>]</m:t>
         </m:r>
       </m:oMath>
-      <w:r>
-        <w:rPr>
-          <w:rFonts w:eastAsia="georgia" w:cs="georgia" w:ascii="georgia" w:hAnsi="georgia"/>
-          <w:color w:val="000000"/>
-        </w:rPr>
-        <w:t xml:space="preserve">. Cada agente aplica una regla local: </w:t>
-      </w:r>
-      <w:r>
-        <w:rPr>
-          <w:rFonts w:eastAsia="georgia" w:cs="georgia" w:ascii="georgia" w:hAnsi="georgia"/>
-          <w:i/>
-          <w:color w:val="000000"/>
-        </w:rPr>
-        <w:t xml:space="preserve">"acércate a quienes piensan similar a ti"</w:t>
-      </w:r>
-      <w:r>
-        <w:rPr>
-          <w:rFonts w:eastAsia="georgia" w:cs="georgia" w:ascii="georgia" w:hAnsi="georgia"/>
-          <w:color w:val="000000"/>
-        </w:rPr>
-        <w:t xml:space="preserve"> (umbral de confianza </w:t>
-      </w:r>
       <m:oMath>
         <m:r>
           <m:rPr>
@@ -8725,13 +8619,6 @@
           <m:t>0.5</m:t>
         </m:r>
       </m:oMath>
-      <w:r>
-        <w:rPr>
-          <w:rFonts w:eastAsia="georgia" w:cs="georgia" w:ascii="georgia" w:hAnsi="georgia"/>
-          <w:color w:val="000000"/>
-        </w:rPr>
-        <w:t xml:space="preserve">, convergencia </w:t>
-      </w:r>
       <m:oMath>
         <m:r>
           <m:rPr>
@@ -8762,11 +8649,7 @@
         </m:r>
       </m:oMath>
       <w:r>
-        <w:rPr>
-          <w:rFonts w:eastAsia="georgia" w:cs="georgia" w:ascii="georgia" w:hAnsi="georgia"/>
-          <w:color w:val="000000"/>
-        </w:rPr>
-        <w:t xml:space="preserve">). En cada paso se selecciona aleatoriamente un par de agentes y se aplica la regla de interacción.</w:t>
+        <w:t>El archivo punto5_abm_atractor.py implementa una población de agentes con opiniones en [0, 1]. A diferencia de una versión homogénea, cada agente tiene SU PROPIO umbral de confianza y SU PROPIO factor μ, muestreados aleatoriamente en [0.1, 0.5]. En cada paso se selecciona al azar un par de agentes y, si ambos se aceptan mutuamente (la diferencia de opiniones es menor que ambos umbrales), cada uno se acerca al otro usando su propio μ. El script barre cuatro tamaños de población N ∈ {2, 3, 20, 50} y reporta, para cada corrida, las opiniones finales, la varianza y el número de clusters estables.</w:t>
       </w:r>
     </w:p>
     <w:p>
@@ -8774,28 +8657,7 @@
         <w:spacing w:line="360" w:after="210" w:lineRule="auto"/>
       </w:pPr>
       <w:r>
-        <w:rPr>
-          <w:rFonts w:eastAsia="georgia" w:cs="georgia" w:ascii="georgia" w:hAnsi="georgia"/>
-          <w:color w:val="000000"/>
-        </w:rPr>
-        <w:t xml:space="preserve">El parámetro </w:t>
-      </w:r>
-      <w:r>
-        <w:rPr>
-          <w:rStyle w:val="VerbatimChar"/>
-          <w:rFonts w:eastAsia="menlo" w:cs="menlo" w:ascii="menlo" w:hAnsi="menlo"/>
-          <w:color w:val="000000"/>
-          <w:sz w:val="18"/>
-          <w:shd w:val="clear" w:color="auto" w:fill="F8F8FA"/>
-        </w:rPr>
-        <w:t xml:space="preserve">UMBRAL_CONFIANZA</w:t>
-      </w:r>
-      <w:r>
-        <w:rPr>
-          <w:rFonts w:eastAsia="georgia" w:cs="georgia" w:ascii="georgia" w:hAnsi="georgia"/>
-          <w:color w:val="000000"/>
-        </w:rPr>
-        <w:t xml:space="preserve"> controla el tipo de atractor que emerge del sistema:</w:t>
+        <w:t>El tipo de atractor que emerge depende de la interacción entre el tamaño de la población N y la distribución heterogénea de umbrales y μ:</w:t>
       </w:r>
     </w:p>
     <w:p>
@@ -8807,40 +8669,7 @@
         <w:spacing w:line="360" w:before="105" w:after="105" w:lineRule="auto"/>
       </w:pPr>
       <w:r>
-        <w:rPr>
-          <w:rStyle w:val="VerbatimChar"/>
-          <w:rFonts w:eastAsia="georgia" w:cs="georgia" w:ascii="georgia" w:hAnsi="georgia"/>
-          <w:b/>
-          <w:color w:val="000000"/>
-          <w:sz w:val="21"/>
-          <w:shd w:val="clear" w:color="auto" w:fill="F8F8FA"/>
-        </w:rPr>
-        <w:t xml:space="preserve">UMBRAL_CONFIANZA &gt; 0.5</w:t>
-      </w:r>
-      <w:r>
-        <w:rPr>
-          <w:rFonts w:eastAsia="georgia" w:cs="georgia" w:ascii="georgia" w:hAnsi="georgia"/>
-          <w:color w:val="000000"/>
-          <w:sz w:val="21"/>
-        </w:rPr>
-        <w:t xml:space="preserve"> → </w:t>
-      </w:r>
-      <w:r>
-        <w:rPr>
-          <w:rFonts w:eastAsia="georgia" w:cs="georgia" w:ascii="georgia" w:hAnsi="georgia"/>
-          <w:b/>
-          <w:color w:val="000000"/>
-          <w:sz w:val="21"/>
-        </w:rPr>
-        <w:t xml:space="preserve">Atractor de punto fijo:</w:t>
-      </w:r>
-      <w:r>
-        <w:rPr>
-          <w:rFonts w:eastAsia="georgia" w:cs="georgia" w:ascii="georgia" w:hAnsi="georgia"/>
-          <w:color w:val="000000"/>
-          <w:sz w:val="21"/>
-        </w:rPr>
-        <w:t xml:space="preserve"> los agentes convergen a un único valor (consenso global), varianza → 0.</w:t>
+        <w:t>• Cuando la heterogeneidad es baja y N pequeño (2–3 agentes), el sistema tiende a un atractor de punto fijo: consenso local o cuasi-consenso dentro del grupo que logra interactuar.</w:t>
       </w:r>
     </w:p>
     <w:p>
@@ -8852,40 +8681,7 @@
         <w:spacing w:line="360" w:before="105" w:after="105" w:lineRule="auto"/>
       </w:pPr>
       <w:r>
-        <w:rPr>
-          <w:rStyle w:val="VerbatimChar"/>
-          <w:rFonts w:eastAsia="georgia" w:cs="georgia" w:ascii="georgia" w:hAnsi="georgia"/>
-          <w:b/>
-          <w:color w:val="000000"/>
-          <w:sz w:val="21"/>
-          <w:shd w:val="clear" w:color="auto" w:fill="F8F8FA"/>
-        </w:rPr>
-        <w:t xml:space="preserve">UMBRAL_CONFIANZA &lt; 0.3</w:t>
-      </w:r>
-      <w:r>
-        <w:rPr>
-          <w:rFonts w:eastAsia="georgia" w:cs="georgia" w:ascii="georgia" w:hAnsi="georgia"/>
-          <w:color w:val="000000"/>
-          <w:sz w:val="21"/>
-        </w:rPr>
-        <w:t xml:space="preserve"> → </w:t>
-      </w:r>
-      <w:r>
-        <w:rPr>
-          <w:rFonts w:eastAsia="georgia" w:cs="georgia" w:ascii="georgia" w:hAnsi="georgia"/>
-          <w:b/>
-          <w:color w:val="000000"/>
-          <w:sz w:val="21"/>
-        </w:rPr>
-        <w:t xml:space="preserve">Atractor de agrupamiento:</w:t>
-      </w:r>
-      <w:r>
-        <w:rPr>
-          <w:rFonts w:eastAsia="georgia" w:cs="georgia" w:ascii="georgia" w:hAnsi="georgia"/>
-          <w:color w:val="000000"/>
-          <w:sz w:val="21"/>
-        </w:rPr>
-        <w:t xml:space="preserve"> se forman clusters estables de opinión que ya no evolucionan.</w:t>
+        <w:t>• Cuando N crece (20, 50 agentes) y la heterogeneidad de umbral/μ es alta, emerge un atractor de agrupamiento: varios clusters de opinión co-existen de forma estable, porque entre clusters la distancia supera el umbral de confianza y no interactúan.</w:t>
       </w:r>
     </w:p>
     <w:p>

</xml_diff>